<commit_message>
Substitui o E-mail 3 de setembro pelo gancho da decisão do STJ
O cliente aprovou os e-mails 1 e 2 e considerou o 3 repetitivo em
relação ao 1, que já tratava da Muralha Digital. A nova versão usa como
gancho a decisão da 3ª Turma do STJ de 14/09/2026 que manteve a
condenação de um condomínio por furto após falha no controle de acesso,
o mesmo tema do vídeo produzido para as redes.

- Fonte citada com número do recurso e relatoria, mais link da matéria
- Conexão com a reforma do Código Civil (PL 4/2025) tratada como projeto
  em tramitação, sem afirmar norma em vigor
- CTA passa a ser visita técnica, sem depender de artigo não publicado
- Calendário e mapa de destinos atualizados

Co-Authored-By: Claude Opus 5 <noreply@anthropic.com>
Claude-Session: https://claude.ai/code/session_011Ls9e1ya7pUeqY3wg4Purw
</commit_message>
<xml_diff>
--- a/clientes/g5-seguranca/email/G5-Seguranca-Emails-Setembro.docx
+++ b/clientes/g5-seguranca/email/G5-Seguranca-Emails-Setembro.docx
@@ -1068,7 +1068,7 @@
                 <w:sz w:val="20"/>
                 <w:szCs w:val="20"/>
               </w:rPr>
-              <w:t xml:space="preserve">3. Condomínio na Muralha</w:t>
+              <w:t xml:space="preserve">3. Decisão do STJ sobre controle de acesso</w:t>
             </w:r>
           </w:p>
         </w:tc>
@@ -1120,7 +1120,7 @@
                 <w:sz w:val="20"/>
                 <w:szCs w:val="20"/>
               </w:rPr>
-              <w:t xml:space="preserve">PASTOR comprimido + urgência real</w:t>
+              <w:t xml:space="preserve">Gancho de autoridade + PAS</w:t>
             </w:r>
           </w:p>
         </w:tc>
@@ -1146,7 +1146,7 @@
                 <w:sz w:val="20"/>
                 <w:szCs w:val="20"/>
               </w:rPr>
-              <w:t xml:space="preserve">Como melhorar a segurança do condomínio</w:t>
+              <w:t xml:space="preserve">Visita técnica, sem página de blog</w:t>
             </w:r>
           </w:p>
         </w:tc>
@@ -1497,7 +1497,7 @@
                 <w:sz w:val="20"/>
                 <w:szCs w:val="20"/>
               </w:rPr>
-              <w:t xml:space="preserve">Como melhorar a segurança do condomínio</w:t>
+              <w:t xml:space="preserve">Visita técnica agendada por resposta ou formulário</w:t>
             </w:r>
           </w:p>
         </w:tc>
@@ -1523,7 +1523,7 @@
                 <w:sz w:val="20"/>
                 <w:szCs w:val="20"/>
               </w:rPr>
-              <w:t xml:space="preserve">/blog/como-melhorar-seguranca-do-condominio</w:t>
+              <w:t xml:space="preserve">/fale-conosco/ (matéria do STJ como link no corpo)</w:t>
             </w:r>
           </w:p>
         </w:tc>
@@ -2632,19 +2632,49 @@
           <w:sz w:val="22"/>
           <w:szCs w:val="22"/>
         </w:rPr>
-        <w:t xml:space="preserve">Técnica: PASTOR comprimido com urgência legítima.</w:t>
-      </w:r>
-      <w:r>
-        <w:rPr>
-          <w:b w:val="false"/>
-          <w:bCs w:val="false"/>
-          <w:i w:val="false"/>
-          <w:iCs w:val="false"/>
-          <w:color w:val="000000"/>
-          <w:sz w:val="22"/>
-          <w:szCs w:val="22"/>
-        </w:rPr>
-        <w:t xml:space="preserve"> O prazo de análise do projeto técnico é real e cria a urgência sem precisar inventar escassez. É o e-mail de conversão da sequência.</w:t>
+        <w:t xml:space="preserve">Versão 2, substitui a anterior.</w:t>
+      </w:r>
+      <w:r>
+        <w:rPr>
+          <w:b w:val="false"/>
+          <w:bCs w:val="false"/>
+          <w:i w:val="false"/>
+          <w:iCs w:val="false"/>
+          <w:color w:val="000000"/>
+          <w:sz w:val="22"/>
+          <w:szCs w:val="22"/>
+        </w:rPr>
+        <w:t xml:space="preserve"> O cliente considerou a primeira versão repetitiva em relação ao E-mail 1, que já tratava da Muralha. Esta versão usa como gancho a decisão do STJ sobre responsabilidade do condomínio por falha no controle de acesso, o mesmo tema do vídeo produzido para as redes.</w:t>
+      </w:r>
+    </w:p>
+    <w:p>
+      <w:pPr>
+        <w:spacing w:after="140" w:line="300"/>
+        <w:jc w:val="both"/>
+      </w:pPr>
+      <w:r>
+        <w:rPr>
+          <w:b/>
+          <w:bCs/>
+          <w:i w:val="false"/>
+          <w:iCs w:val="false"/>
+          <w:color w:val="000000"/>
+          <w:sz w:val="22"/>
+          <w:szCs w:val="22"/>
+        </w:rPr>
+        <w:t xml:space="preserve">Técnica: gancho de autoridade com PAS comprimido.</w:t>
+      </w:r>
+      <w:r>
+        <w:rPr>
+          <w:b w:val="false"/>
+          <w:bCs w:val="false"/>
+          <w:i w:val="false"/>
+          <w:iCs w:val="false"/>
+          <w:color w:val="000000"/>
+          <w:sz w:val="22"/>
+          <w:szCs w:val="22"/>
+        </w:rPr>
+        <w:t xml:space="preserve"> A notícia faz o trabalho de agitação sozinha, então o corpo vai direto ao ponto decisivo da decisão e fecha em ação. É o e-mail de conversão do mês.</w:t>
       </w:r>
     </w:p>
     <w:p>
@@ -2695,19 +2725,19 @@
           <w:sz w:val="22"/>
           <w:szCs w:val="22"/>
         </w:rPr>
-        <w:t xml:space="preserve">Síndico: seu condomínio pode entrar na Muralha</w:t>
-      </w:r>
-      <w:r>
-        <w:rPr>
-          <w:b w:val="false"/>
-          <w:bCs w:val="false"/>
-          <w:i w:val="false"/>
-          <w:iCs w:val="false"/>
-          <w:color w:val="000000"/>
-          <w:sz w:val="22"/>
-          <w:szCs w:val="22"/>
-        </w:rPr>
-        <w:t xml:space="preserve"> (46 caracteres)</w:t>
+        <w:t xml:space="preserve">O porteiro liberou. O condomínio pagou a conta.</w:t>
+      </w:r>
+      <w:r>
+        <w:rPr>
+          <w:b w:val="false"/>
+          <w:bCs w:val="false"/>
+          <w:i w:val="false"/>
+          <w:iCs w:val="false"/>
+          <w:color w:val="000000"/>
+          <w:sz w:val="22"/>
+          <w:szCs w:val="22"/>
+        </w:rPr>
+        <w:t xml:space="preserve"> (47 caracteres)</w:t>
       </w:r>
     </w:p>
     <w:p>
@@ -2740,7 +2770,7 @@
           <w:sz w:val="22"/>
           <w:szCs w:val="22"/>
         </w:rPr>
-        <w:t xml:space="preserve">Quem entrar agora só integra a Muralha em novembro</w:t>
+        <w:t xml:space="preserve">STJ: falha na portaria responsabiliza o condomínio</w:t>
       </w:r>
       <w:r>
         <w:rPr>
@@ -2793,7 +2823,7 @@
           <w:sz w:val="22"/>
           <w:szCs w:val="22"/>
         </w:rPr>
-        <w:t xml:space="preserve">A análise do projeto técnico leva cerca de 45 dias.</w:t>
+        <w:t xml:space="preserve">A 3ª Turma manteve a condenação em 14 de setembro.</w:t>
       </w:r>
     </w:p>
     <w:p>
@@ -2847,169 +2877,295 @@
           <w:sz w:val="22"/>
           <w:szCs w:val="22"/>
         </w:rPr>
-        <w:t xml:space="preserve">A pergunta chegou de três síndicos diferentes nas últimas semanas: o condomínio pode integrar as câmeras à Muralha Digital de Curitiba?</w:t>
-      </w:r>
-    </w:p>
-    <w:p>
-      <w:pPr>
-        <w:spacing w:after="140" w:line="300"/>
-        <w:jc w:val="both"/>
-      </w:pPr>
-      <w:r>
-        <w:rPr>
-          <w:b w:val="false"/>
-          <w:bCs w:val="false"/>
-          <w:i w:val="false"/>
-          <w:iCs w:val="false"/>
-          <w:color w:val="000000"/>
-          <w:sz w:val="22"/>
-          <w:szCs w:val="22"/>
-        </w:rPr>
-        <w:t xml:space="preserve">Pode. E vale entender o processo antes da próxima assembleia, por um motivo prático que aparece no fim deste e-mail.</w:t>
-      </w:r>
-    </w:p>
-    <w:p>
-      <w:pPr>
-        <w:spacing w:after="140" w:line="300"/>
-        <w:jc w:val="both"/>
-      </w:pPr>
-      <w:r>
-        <w:rPr>
-          <w:b/>
-          <w:bCs/>
-          <w:i w:val="false"/>
-          <w:iCs w:val="false"/>
-          <w:color w:val="000000"/>
-          <w:sz w:val="22"/>
-          <w:szCs w:val="22"/>
-        </w:rPr>
-        <w:t xml:space="preserve">O que o condomínio precisa ter</w:t>
-      </w:r>
-    </w:p>
-    <w:p>
-      <w:pPr>
-        <w:spacing w:after="140" w:line="300"/>
-        <w:jc w:val="both"/>
-      </w:pPr>
-      <w:r>
-        <w:rPr>
-          <w:b w:val="false"/>
-          <w:bCs w:val="false"/>
-          <w:i w:val="false"/>
-          <w:iCs w:val="false"/>
-          <w:color w:val="000000"/>
-          <w:sz w:val="22"/>
-          <w:szCs w:val="22"/>
-        </w:rPr>
-        <w:t xml:space="preserve">O licenciamento é eletrônico, feito pelo Guia de Serviços da Prefeitura, e o Comitê Gestor de Videomonitoramento analisa o projeto técnico antes de autorizar. Na prática, o condomínio precisa de câmeras com qualidade suficiente para identificação, conectividade estável, posicionamento voltado à via pública e o acompanhamento de uma empresa de segurança credenciada na Polícia Federal.</w:t>
-      </w:r>
-    </w:p>
-    <w:p>
-      <w:pPr>
-        <w:spacing w:after="140" w:line="300"/>
-        <w:jc w:val="both"/>
-      </w:pPr>
-      <w:r>
-        <w:rPr>
-          <w:b/>
-          <w:bCs/>
-          <w:i w:val="false"/>
-          <w:iCs w:val="false"/>
-          <w:color w:val="000000"/>
-          <w:sz w:val="22"/>
-          <w:szCs w:val="22"/>
-        </w:rPr>
-        <w:t xml:space="preserve">O que costuma travar na assembleia</w:t>
-      </w:r>
-    </w:p>
-    <w:p>
-      <w:pPr>
-        <w:spacing w:after="140" w:line="300"/>
-        <w:jc w:val="both"/>
-      </w:pPr>
-      <w:r>
-        <w:rPr>
-          <w:b w:val="false"/>
-          <w:bCs w:val="false"/>
-          <w:i w:val="false"/>
-          <w:iCs w:val="false"/>
-          <w:color w:val="000000"/>
-          <w:sz w:val="22"/>
-          <w:szCs w:val="22"/>
-        </w:rPr>
-        <w:t xml:space="preserve">A objeção mais comum é a privacidade dos moradores, e ela merece resposta clara: a câmera integrada mira o espaço público, não o interior do condomínio. Áreas comuns, garagem e circulação interna continuam sob controle exclusivo do condomínio. Vale registrar essa decisão em ata junto com a política de acesso às imagens.</w:t>
-      </w:r>
-    </w:p>
-    <w:p>
-      <w:pPr>
-        <w:spacing w:after="140" w:line="300"/>
-        <w:jc w:val="both"/>
-      </w:pPr>
-      <w:r>
-        <w:rPr>
-          <w:b/>
-          <w:bCs/>
-          <w:i w:val="false"/>
-          <w:iCs w:val="false"/>
-          <w:color w:val="000000"/>
-          <w:sz w:val="22"/>
-          <w:szCs w:val="22"/>
-        </w:rPr>
-        <w:t xml:space="preserve">Por que decidir agora</w:t>
-      </w:r>
-    </w:p>
-    <w:p>
-      <w:pPr>
-        <w:spacing w:after="140" w:line="300"/>
-        <w:jc w:val="both"/>
-      </w:pPr>
-      <w:r>
-        <w:rPr>
-          <w:b w:val="false"/>
-          <w:bCs w:val="false"/>
-          <w:i w:val="false"/>
-          <w:iCs w:val="false"/>
-          <w:color w:val="000000"/>
-          <w:sz w:val="22"/>
-          <w:szCs w:val="22"/>
-        </w:rPr>
-        <w:t xml:space="preserve">A análise do projeto leva cerca de 45 dias. Um condomínio que aprovar o assunto na assembleia de outubro dificilmente estará integrado antes de novembro, e a adequação técnica que antecede o pedido também consome tempo. Quem começa em setembro entra na fila com folga.</w:t>
-      </w:r>
-    </w:p>
-    <w:p>
-      <w:pPr>
-        <w:spacing w:after="140" w:line="300"/>
-        <w:jc w:val="both"/>
-      </w:pPr>
-      <w:r>
-        <w:rPr>
-          <w:b w:val="false"/>
-          <w:bCs w:val="false"/>
-          <w:i w:val="false"/>
-          <w:iCs w:val="false"/>
-          <w:color w:val="000000"/>
-          <w:sz w:val="22"/>
-          <w:szCs w:val="22"/>
-        </w:rPr>
-        <w:t xml:space="preserve">Antes do formulário da Prefeitura, porém, vem uma pergunta mais simples: as câmeras do seu condomínio identificam placa e rosto nos acessos? Câmera que não identifica não serve para a integração, e também não serve para o condomínio.</w:t>
-      </w:r>
-    </w:p>
-    <w:p>
-      <w:pPr>
-        <w:spacing w:after="140" w:line="300"/>
-        <w:jc w:val="both"/>
-      </w:pPr>
-      <w:r>
-        <w:rPr>
-          <w:b w:val="false"/>
-          <w:bCs w:val="false"/>
-          <w:i w:val="false"/>
-          <w:iCs w:val="false"/>
-          <w:color w:val="000000"/>
-          <w:sz w:val="22"/>
-          <w:szCs w:val="22"/>
-        </w:rPr>
-        <w:t xml:space="preserve">Reunimos em um guia as falhas de segurança que mais aparecem em condomínios de Curitiba, com a ordem de correção que dá mais resultado por menos investimento. É por aí que a conversa começa.</w:t>
+        <w:t xml:space="preserve">Em 14 de setembro, a 3ª Turma do Superior Tribunal de Justiça manteve, por unanimidade, a condenação de um condomínio do Rio de Janeiro por um furto ocorrido dentro de um apartamento.</w:t>
+      </w:r>
+    </w:p>
+    <w:p>
+      <w:pPr>
+        <w:spacing w:after="140" w:line="300"/>
+        <w:jc w:val="both"/>
+      </w:pPr>
+      <w:r>
+        <w:rPr>
+          <w:b w:val="false"/>
+          <w:bCs w:val="false"/>
+          <w:i w:val="false"/>
+          <w:iCs w:val="false"/>
+          <w:color w:val="000000"/>
+          <w:sz w:val="22"/>
+          <w:szCs w:val="22"/>
+        </w:rPr>
+        <w:t xml:space="preserve">Vale prestar atenção no que foi decisivo, porque não é o que a maioria imagina.</w:t>
+      </w:r>
+    </w:p>
+    <w:p>
+      <w:pPr>
+        <w:spacing w:after="140" w:line="300"/>
+        <w:jc w:val="both"/>
+      </w:pPr>
+      <w:r>
+        <w:rPr>
+          <w:b w:val="false"/>
+          <w:bCs w:val="false"/>
+          <w:i w:val="false"/>
+          <w:iCs w:val="false"/>
+          <w:color w:val="000000"/>
+          <w:sz w:val="22"/>
+          <w:szCs w:val="22"/>
+        </w:rPr>
+        <w:t xml:space="preserve">O condomínio não foi responsabilizado por não ter segurança. Ele foi responsabilizado porque os criminosos entraram no prédio sem que a identidade fosse verificada e sem que o morador tivesse autorizado a entrada. A liberação partiu de um preposto do condomínio. A falha estava no procedimento, não no equipamento.</w:t>
+      </w:r>
+    </w:p>
+    <w:p>
+      <w:pPr>
+        <w:spacing w:after="140" w:line="300"/>
+        <w:jc w:val="both"/>
+      </w:pPr>
+      <w:r>
+        <w:rPr>
+          <w:b w:val="false"/>
+          <w:bCs w:val="false"/>
+          <w:i w:val="false"/>
+          <w:iCs w:val="false"/>
+          <w:color w:val="000000"/>
+          <w:sz w:val="22"/>
+          <w:szCs w:val="22"/>
+        </w:rPr>
+        <w:t xml:space="preserve">O condomínio ainda argumentou que a convenção não previa responsabilidade por furtos dentro das unidades. O argumento foi rejeitado.</w:t>
+      </w:r>
+    </w:p>
+    <w:p>
+      <w:pPr>
+        <w:spacing w:after="140" w:line="300"/>
+        <w:jc w:val="both"/>
+      </w:pPr>
+      <w:r>
+        <w:rPr>
+          <w:b w:val="false"/>
+          <w:bCs w:val="false"/>
+          <w:i w:val="false"/>
+          <w:iCs w:val="false"/>
+          <w:color w:val="000000"/>
+          <w:sz w:val="22"/>
+          <w:szCs w:val="22"/>
+        </w:rPr>
+        <w:t xml:space="preserve">A decisão é o Recurso Especial 2.264.505, de relatoria da ministra Nancy Andrighi. [Leia a matéria completa aqui](https://www.condominiointerativo.com.br/noticia/5397/noticias/stj-mantem-condenacao-de-condominio-por-furto-apos-falha-no-controle-de-acesso.html).</w:t>
+      </w:r>
+    </w:p>
+    <w:p>
+      <w:pPr>
+        <w:spacing w:after="140" w:line="300"/>
+        <w:jc w:val="both"/>
+      </w:pPr>
+      <w:r>
+        <w:rPr>
+          <w:b/>
+          <w:bCs/>
+          <w:i w:val="false"/>
+          <w:iCs w:val="false"/>
+          <w:color w:val="000000"/>
+          <w:sz w:val="22"/>
+          <w:szCs w:val="22"/>
+        </w:rPr>
+        <w:t xml:space="preserve">O que isso significa na prática</w:t>
+      </w:r>
+    </w:p>
+    <w:p>
+      <w:pPr>
+        <w:spacing w:after="140" w:line="300"/>
+        <w:jc w:val="both"/>
+      </w:pPr>
+      <w:r>
+        <w:rPr>
+          <w:b w:val="false"/>
+          <w:bCs w:val="false"/>
+          <w:i w:val="false"/>
+          <w:iCs w:val="false"/>
+          <w:color w:val="000000"/>
+          <w:sz w:val="22"/>
+          <w:szCs w:val="22"/>
+        </w:rPr>
+        <w:t xml:space="preserve">A responsabilidade do condomínio por crime praticado por terceiro não é automática. Ela aparece quando existe ação ou omissão negligente que contribui para o crime. E o que o tribunal examinou foi justamente o procedimento de identificação e liberação da portaria.</w:t>
+      </w:r>
+    </w:p>
+    <w:p>
+      <w:pPr>
+        <w:spacing w:after="140" w:line="300"/>
+        <w:jc w:val="both"/>
+      </w:pPr>
+      <w:r>
+        <w:rPr>
+          <w:b w:val="false"/>
+          <w:bCs w:val="false"/>
+          <w:i w:val="false"/>
+          <w:iCs w:val="false"/>
+          <w:color w:val="000000"/>
+          <w:sz w:val="22"/>
+          <w:szCs w:val="22"/>
+        </w:rPr>
+        <w:t xml:space="preserve">Traduzindo para a rotina: quem autorizou, como confirmou e onde isso ficou registrado deixaram de ser detalhe operacional e passaram a ser prova.</w:t>
+      </w:r>
+    </w:p>
+    <w:p>
+      <w:pPr>
+        <w:spacing w:after="140" w:line="300"/>
+        <w:jc w:val="both"/>
+      </w:pPr>
+      <w:r>
+        <w:rPr>
+          <w:b/>
+          <w:bCs/>
+          <w:i w:val="false"/>
+          <w:iCs w:val="false"/>
+          <w:color w:val="000000"/>
+          <w:sz w:val="22"/>
+          <w:szCs w:val="22"/>
+        </w:rPr>
+        <w:t xml:space="preserve">E a conversa fica mais exigente daqui para frente</w:t>
+      </w:r>
+    </w:p>
+    <w:p>
+      <w:pPr>
+        <w:spacing w:after="140" w:line="300"/>
+        <w:jc w:val="both"/>
+      </w:pPr>
+      <w:r>
+        <w:rPr>
+          <w:b w:val="false"/>
+          <w:bCs w:val="false"/>
+          <w:i w:val="false"/>
+          <w:iCs w:val="false"/>
+          <w:color w:val="000000"/>
+          <w:sz w:val="22"/>
+          <w:szCs w:val="22"/>
+        </w:rPr>
+        <w:t xml:space="preserve">A reforma do Código Civil, que tramita no Senado como Projeto de Lei 4 de 2025 e tem votação projetada para este semestre, caminha na mesma direção: profissionalização da gestão condominial, consolidação das assembleias eletrônicas e regras mais claras de responsabilidade. Enquanto o texto não é aprovado, valem as regras atuais. Mas a direção da discussão é uma só, e ela cobra procedimento documentado.</w:t>
+      </w:r>
+    </w:p>
+    <w:p>
+      <w:pPr>
+        <w:spacing w:after="140" w:line="300"/>
+        <w:jc w:val="both"/>
+      </w:pPr>
+      <w:r>
+        <w:rPr>
+          <w:b/>
+          <w:bCs/>
+          <w:i w:val="false"/>
+          <w:iCs w:val="false"/>
+          <w:color w:val="000000"/>
+          <w:sz w:val="22"/>
+          <w:szCs w:val="22"/>
+        </w:rPr>
+        <w:t xml:space="preserve">Quatro perguntas para levar à próxima assembleia</w:t>
+      </w:r>
+    </w:p>
+    <w:p>
+      <w:pPr>
+        <w:spacing w:after="140" w:line="300"/>
+        <w:jc w:val="both"/>
+      </w:pPr>
+      <w:r>
+        <w:rPr>
+          <w:b w:val="false"/>
+          <w:bCs w:val="false"/>
+          <w:i w:val="false"/>
+          <w:iCs w:val="false"/>
+          <w:color w:val="000000"/>
+          <w:sz w:val="22"/>
+          <w:szCs w:val="22"/>
+        </w:rPr>
+        <w:t xml:space="preserve">Um visitante consegue entrar hoje sem confirmação do morador?</w:t>
+      </w:r>
+    </w:p>
+    <w:p>
+      <w:pPr>
+        <w:spacing w:after="140" w:line="300"/>
+        <w:jc w:val="both"/>
+      </w:pPr>
+      <w:r>
+        <w:rPr>
+          <w:b w:val="false"/>
+          <w:bCs w:val="false"/>
+          <w:i w:val="false"/>
+          <w:iCs w:val="false"/>
+          <w:color w:val="000000"/>
+          <w:sz w:val="22"/>
+          <w:szCs w:val="22"/>
+        </w:rPr>
+        <w:t xml:space="preserve">Existe registro de quem autorizou cada liberação, com data e hora?</w:t>
+      </w:r>
+    </w:p>
+    <w:p>
+      <w:pPr>
+        <w:spacing w:after="140" w:line="300"/>
+        <w:jc w:val="both"/>
+      </w:pPr>
+      <w:r>
+        <w:rPr>
+          <w:b w:val="false"/>
+          <w:bCs w:val="false"/>
+          <w:i w:val="false"/>
+          <w:iCs w:val="false"/>
+          <w:color w:val="000000"/>
+          <w:sz w:val="22"/>
+          <w:szCs w:val="22"/>
+        </w:rPr>
+        <w:t xml:space="preserve">Prestadores recorrentes têm credencial com validade ou entram no reconhecimento do porteiro?</w:t>
+      </w:r>
+    </w:p>
+    <w:p>
+      <w:pPr>
+        <w:spacing w:after="140" w:line="300"/>
+        <w:jc w:val="both"/>
+      </w:pPr>
+      <w:r>
+        <w:rPr>
+          <w:b w:val="false"/>
+          <w:bCs w:val="false"/>
+          <w:i w:val="false"/>
+          <w:iCs w:val="false"/>
+          <w:color w:val="000000"/>
+          <w:sz w:val="22"/>
+          <w:szCs w:val="22"/>
+        </w:rPr>
+        <w:t xml:space="preserve">O condomínio consegue reconstituir uma entrada de três meses atrás?</w:t>
+      </w:r>
+    </w:p>
+    <w:p>
+      <w:pPr>
+        <w:spacing w:after="140" w:line="300"/>
+        <w:jc w:val="both"/>
+      </w:pPr>
+      <w:r>
+        <w:rPr>
+          <w:b w:val="false"/>
+          <w:bCs w:val="false"/>
+          <w:i w:val="false"/>
+          <w:iCs w:val="false"/>
+          <w:color w:val="000000"/>
+          <w:sz w:val="22"/>
+          <w:szCs w:val="22"/>
+        </w:rPr>
+        <w:t xml:space="preserve">Se a resposta de alguma delas for incômoda, o problema não está na tecnologia, está no protocolo. E protocolo se resolve antes do incidente, não depois.</w:t>
+      </w:r>
+    </w:p>
+    <w:p>
+      <w:pPr>
+        <w:spacing w:after="140" w:line="300"/>
+        <w:jc w:val="both"/>
+      </w:pPr>
+      <w:r>
+        <w:rPr>
+          <w:b w:val="false"/>
+          <w:bCs w:val="false"/>
+          <w:i w:val="false"/>
+          <w:iCs w:val="false"/>
+          <w:color w:val="000000"/>
+          <w:sz w:val="22"/>
+          <w:szCs w:val="22"/>
+        </w:rPr>
+        <w:t xml:space="preserve">A G5 reúne portaria remota, controle de acesso e monitoramento 24 horas para organizar cada etapa do acesso, com protocolos definidos para a operação de cada condomínio e registro consultável de todas as liberações.</w:t>
       </w:r>
     </w:p>
     <w:p>
@@ -3026,97 +3182,99 @@
           <w:sz w:val="22"/>
           <w:szCs w:val="22"/>
         </w:rPr>
-        <w:t xml:space="preserve">BOTÃO: Ver as falhas mais comuns na segurança de condomínios</w:t>
-      </w:r>
-    </w:p>
-    <w:p>
-      <w:pPr>
-        <w:spacing w:after="140" w:line="300"/>
-        <w:jc w:val="both"/>
-      </w:pPr>
-      <w:r>
-        <w:rPr>
-          <w:b w:val="false"/>
-          <w:bCs w:val="false"/>
-          <w:i w:val="false"/>
-          <w:iCs w:val="false"/>
-          <w:color w:val="000000"/>
-          <w:sz w:val="22"/>
-          <w:szCs w:val="22"/>
-        </w:rPr>
-        <w:t xml:space="preserve">Se preferir avançar direto, respondemos este e-mail com uma visita técnica agendada. Avaliamos o que o seu condomínio já tem, o que falta e quanto custa a adequação, sem compromisso.</w:t>
-      </w:r>
-    </w:p>
-    <w:p>
-      <w:pPr>
-        <w:spacing w:after="140" w:line="300"/>
-        <w:jc w:val="both"/>
-      </w:pPr>
-      <w:r>
-        <w:rPr>
-          <w:b w:val="false"/>
-          <w:bCs w:val="false"/>
-          <w:i w:val="false"/>
-          <w:iCs w:val="false"/>
-          <w:color w:val="000000"/>
-          <w:sz w:val="22"/>
-          <w:szCs w:val="22"/>
-        </w:rPr>
-        <w:t xml:space="preserve">Um abraço,</w:t>
-      </w:r>
-    </w:p>
-    <w:p>
-      <w:pPr>
-        <w:spacing w:after="140" w:line="300"/>
-        <w:jc w:val="both"/>
-      </w:pPr>
-      <w:r>
-        <w:rPr>
-          <w:b w:val="false"/>
-          <w:bCs w:val="false"/>
-          <w:i w:val="false"/>
-          <w:iCs w:val="false"/>
-          <w:color w:val="000000"/>
-          <w:sz w:val="22"/>
-          <w:szCs w:val="22"/>
-        </w:rPr>
-        <w:t xml:space="preserve">[Nome] | [Cargo]</w:t>
-      </w:r>
-    </w:p>
-    <w:p>
-      <w:pPr>
-        <w:spacing w:after="140" w:line="300"/>
-        <w:jc w:val="both"/>
-      </w:pPr>
-      <w:r>
-        <w:rPr>
-          <w:b w:val="false"/>
-          <w:bCs w:val="false"/>
-          <w:i w:val="false"/>
-          <w:iCs w:val="false"/>
-          <w:color w:val="000000"/>
-          <w:sz w:val="22"/>
-          <w:szCs w:val="22"/>
-        </w:rPr>
-        <w:t xml:space="preserve">G5 Segurança Integrada</w:t>
-      </w:r>
-    </w:p>
-    <w:p>
-      <w:pPr>
-        <w:spacing w:after="140" w:line="300"/>
-        <w:jc w:val="both"/>
-      </w:pPr>
-      <w:r>
-        <w:rPr>
-          <w:b w:val="false"/>
-          <w:bCs w:val="false"/>
-          <w:i w:val="false"/>
-          <w:iCs w:val="false"/>
-          <w:color w:val="000000"/>
-          <w:sz w:val="22"/>
-          <w:szCs w:val="22"/>
-        </w:rPr>
-        <w:t xml:space="preserve">[Telefone] | [WhatsApp]</w:t>
+        <w:t xml:space="preserve">BOTÃO: Avaliar o controle de acesso do meu condomínio</w:t>
+      </w:r>
+    </w:p>
+    <w:p>
+      <w:pPr>
+        <w:spacing w:after="140" w:line="300"/>
+        <w:jc w:val="both"/>
+      </w:pPr>
+      <w:r>
+        <w:rPr>
+          <w:b w:val="false"/>
+          <w:bCs w:val="false"/>
+          <w:i w:val="false"/>
+          <w:iCs w:val="false"/>
+          <w:color w:val="000000"/>
+          <w:sz w:val="22"/>
+          <w:szCs w:val="22"/>
+        </w:rPr>
+        <w:t xml:space="preserve">A visita técnica é gratuita. Avaliamos o que o seu condomínio já tem, onde estão as brechas de procedimento e o que precisa mudar, sem compromisso.</w:t>
+      </w:r>
+    </w:p>
+    <w:p>
+      <w:pPr>
+        <w:spacing w:after="140" w:line="300"/>
+        <w:jc w:val="both"/>
+      </w:pPr>
+      <w:r>
+        <w:rPr>
+          <w:b w:val="false"/>
+          <w:bCs w:val="false"/>
+          <w:i w:val="false"/>
+          <w:iCs w:val="false"/>
+          <w:color w:val="000000"/>
+          <w:sz w:val="22"/>
+          <w:szCs w:val="22"/>
+        </w:rPr>
+        <w:t xml:space="preserve">Abraços,</w:t>
+      </w:r>
+    </w:p>
+    <w:p>
+      <w:pPr>
+        <w:spacing w:after="140" w:line="300"/>
+        <w:jc w:val="both"/>
+      </w:pPr>
+      <w:r>
+        <w:rPr>
+          <w:b w:val="false"/>
+          <w:bCs w:val="false"/>
+          <w:i w:val="false"/>
+          <w:iCs w:val="false"/>
+          <w:color w:val="000000"/>
+          <w:sz w:val="22"/>
+          <w:szCs w:val="22"/>
+        </w:rPr>
+        <w:t xml:space="preserve">Amanda Sanchez</w:t>
+      </w:r>
+    </w:p>
+    <w:p>
+      <w:pPr>
+        <w:spacing w:after="140" w:line="300"/>
+        <w:jc w:val="both"/>
+      </w:pPr>
+      <w:r>
+        <w:rPr>
+          <w:b w:val="false"/>
+          <w:bCs w:val="false"/>
+          <w:i w:val="false"/>
+          <w:iCs w:val="false"/>
+          <w:color w:val="000000"/>
+          <w:sz w:val="22"/>
+          <w:szCs w:val="22"/>
+        </w:rPr>
+        <w:t xml:space="preserve">(41) 3045-9518</w:t>
+      </w:r>
+    </w:p>
+    <w:p>
+      <w:pPr>
+        <w:pBdr>
+          <w:top w:val="single" w:color="D9D9D9" w:sz="2"/>
+        </w:pBdr>
+        <w:spacing w:after="140" w:before="140" w:line="300"/>
+      </w:pPr>
+      <w:r>
+        <w:rPr>
+          <w:b w:val="false"/>
+          <w:bCs w:val="false"/>
+          <w:i/>
+          <w:iCs/>
+          <w:color w:val="595959"/>
+          <w:sz w:val="20"/>
+          <w:szCs w:val="20"/>
+        </w:rPr>
+        <w:t xml:space="preserve">P.S. A decisão não criou regra nova. Ela aplicou a regra que já existe a um caso concreto de portaria. É por isso que ela funciona tão bem como pauta de assembleia.</w:t>
       </w:r>
     </w:p>
     <w:p>
@@ -3381,8 +3539,8 @@
       </w:r>
     </w:p>
     <w:sectPr>
-      <w:headerReference w:type="default" r:id="rId7"/>
-      <w:footerReference w:type="default" r:id="rId8"/>
+      <w:headerReference w:type="default" r:id="rId6"/>
+      <w:footerReference w:type="default" r:id="rId7"/>
       <w:pgSz w:w="11906" w:h="16838" w:orient="portrait"/>
       <w:pgMar w:top="1440" w:right="1440" w:bottom="1440" w:left="1440" w:header="708" w:footer="708" w:gutter="0"/>
       <w:pgNumType/>
@@ -3390,10 +3548,6 @@
     </w:sectPr>
   </w:body>
 </w:document>
-</file>
-
-<file path=word/comments.xml><?xml version="1.0" encoding="utf-8"?>
-<w:comments xmlns:cx="http://schemas.microsoft.com/office/drawing/2014/chartex" xmlns:cx1="http://schemas.microsoft.com/office/drawing/2015/9/8/chartex" xmlns:cx2="http://schemas.microsoft.com/office/drawing/2015/10/21/chartex" xmlns:cx3="http://schemas.microsoft.com/office/drawing/2016/5/9/chartex" xmlns:cx4="http://schemas.microsoft.com/office/drawing/2016/5/10/chartex" xmlns:cx5="http://schemas.microsoft.com/office/drawing/2016/5/11/chartex" xmlns:cx6="http://schemas.microsoft.com/office/drawing/2016/5/12/chartex" xmlns:cx7="http://schemas.microsoft.com/office/drawing/2016/5/13/chartex" xmlns:cx8="http://schemas.microsoft.com/office/drawing/2016/5/14/chartex" xmlns:mc="http://schemas.openxmlformats.org/markup-compatibility/2006" xmlns:aink="http://schemas.microsoft.com/office/drawing/2016/ink" xmlns:am3d="http://schemas.microsoft.com/office/drawing/2017/model3d" xmlns:o="urn:schemas-microsoft-com:office:office" xmlns:r="http://schemas.openxmlformats.org/officeDocument/2006/relationships" xmlns:m="http://schemas.openxmlformats.org/officeDocument/2006/math" xmlns:v="urn:schemas-microsoft-com:vml" xmlns:wp14="http://schemas.microsoft.com/office/word/2010/wordprocessingDrawing" xmlns:wp="http://schemas.openxmlformats.org/drawingml/2006/wordprocessingDrawing" xmlns:w10="urn:schemas-microsoft-com:office:word" xmlns:w="http://schemas.openxmlformats.org/wordprocessingml/2006/main" xmlns:w14="http://schemas.microsoft.com/office/word/2010/wordml" xmlns:w15="http://schemas.microsoft.com/office/word/2012/wordml" xmlns:w16cex="http://schemas.microsoft.com/office/word/2018/wordml/cex" xmlns:w16cid="http://schemas.microsoft.com/office/word/2016/wordml/cid" xmlns:w16="http://schemas.microsoft.com/office/word/2018/wordml" xmlns:w16sdtdh="http://schemas.microsoft.com/office/word/2020/wordml/sdtdatahash" xmlns:w16se="http://schemas.microsoft.com/office/word/2015/wordml/symex" xmlns:wpg="http://schemas.microsoft.com/office/word/2010/wordprocessingGroup" xmlns:wpi="http://schemas.microsoft.com/office/word/2010/wordprocessingInk" xmlns:wne="http://schemas.microsoft.com/office/word/2006/wordml" xmlns:wps="http://schemas.microsoft.com/office/word/2010/wordprocessingShape"/>
 </file>
 
 <file path=word/endnotes.xml><?xml version="1.0" encoding="utf-8"?>
@@ -3519,7 +3673,7 @@
 <w:numbering xmlns:wpc="http://schemas.microsoft.com/office/word/2010/wordprocessingCanvas" xmlns:mc="http://schemas.openxmlformats.org/markup-compatibility/2006" xmlns:o="urn:schemas-microsoft-com:office:office" xmlns:r="http://schemas.openxmlformats.org/officeDocument/2006/relationships" xmlns:m="http://schemas.openxmlformats.org/officeDocument/2006/math" xmlns:v="urn:schemas-microsoft-com:vml" xmlns:wp14="http://schemas.microsoft.com/office/word/2010/wordprocessingDrawing" xmlns:wp="http://schemas.openxmlformats.org/drawingml/2006/wordprocessingDrawing" xmlns:w10="urn:schemas-microsoft-com:office:word" xmlns:w="http://schemas.openxmlformats.org/wordprocessingml/2006/main" xmlns:w14="http://schemas.microsoft.com/office/word/2010/wordml" xmlns:w15="http://schemas.microsoft.com/office/word/2012/wordml" xmlns:wpg="http://schemas.microsoft.com/office/word/2010/wordprocessingGroup" xmlns:wpi="http://schemas.microsoft.com/office/word/2010/wordprocessingInk" xmlns:wne="http://schemas.microsoft.com/office/word/2006/wordml" xmlns:wps="http://schemas.microsoft.com/office/word/2010/wordprocessingShape" mc:Ignorable="w14 w15 wp14">
   <w:abstractNum w:abstractNumId="1" w15:restartNumberingAfterBreak="0">
     <w:multiLevelType w:val="hybridMultilevel"/>
-    <w:lvl w:ilvl="0" w15:tentative="1">
+    <w:lvl w:ilvl="0" w:tentative="1">
       <w:start w:val="1"/>
       <w:numFmt w:val="bullet"/>
       <w:lvlText w:val="●"/>
@@ -3528,7 +3682,7 @@
         <w:ind w:left="720" w:hanging="360"/>
       </w:pPr>
     </w:lvl>
-    <w:lvl w:ilvl="1" w15:tentative="1">
+    <w:lvl w:ilvl="1" w:tentative="1">
       <w:start w:val="1"/>
       <w:numFmt w:val="bullet"/>
       <w:lvlText w:val="○"/>
@@ -3537,7 +3691,7 @@
         <w:ind w:left="1440" w:hanging="360"/>
       </w:pPr>
     </w:lvl>
-    <w:lvl w:ilvl="2" w15:tentative="1">
+    <w:lvl w:ilvl="2" w:tentative="1">
       <w:start w:val="1"/>
       <w:numFmt w:val="bullet"/>
       <w:lvlText w:val="■"/>
@@ -3546,7 +3700,7 @@
         <w:ind w:left="2160" w:hanging="360"/>
       </w:pPr>
     </w:lvl>
-    <w:lvl w:ilvl="3" w15:tentative="1">
+    <w:lvl w:ilvl="3" w:tentative="1">
       <w:start w:val="1"/>
       <w:numFmt w:val="bullet"/>
       <w:lvlText w:val="●"/>
@@ -3555,7 +3709,7 @@
         <w:ind w:left="2880" w:hanging="360"/>
       </w:pPr>
     </w:lvl>
-    <w:lvl w:ilvl="4" w15:tentative="1">
+    <w:lvl w:ilvl="4" w:tentative="1">
       <w:start w:val="1"/>
       <w:numFmt w:val="bullet"/>
       <w:lvlText w:val="○"/>
@@ -3564,7 +3718,7 @@
         <w:ind w:left="3600" w:hanging="360"/>
       </w:pPr>
     </w:lvl>
-    <w:lvl w:ilvl="5" w15:tentative="1">
+    <w:lvl w:ilvl="5" w:tentative="1">
       <w:start w:val="1"/>
       <w:numFmt w:val="bullet"/>
       <w:lvlText w:val="■"/>
@@ -3573,7 +3727,7 @@
         <w:ind w:left="4320" w:hanging="360"/>
       </w:pPr>
     </w:lvl>
-    <w:lvl w:ilvl="6" w15:tentative="1">
+    <w:lvl w:ilvl="6" w:tentative="1">
       <w:start w:val="1"/>
       <w:numFmt w:val="bullet"/>
       <w:lvlText w:val="●"/>
@@ -3582,7 +3736,7 @@
         <w:ind w:left="5040" w:hanging="360"/>
       </w:pPr>
     </w:lvl>
-    <w:lvl w:ilvl="7" w15:tentative="1">
+    <w:lvl w:ilvl="7" w:tentative="1">
       <w:start w:val="1"/>
       <w:numFmt w:val="bullet"/>
       <w:lvlText w:val="●"/>
@@ -3591,7 +3745,7 @@
         <w:ind w:left="5760" w:hanging="360"/>
       </w:pPr>
     </w:lvl>
-    <w:lvl w:ilvl="8" w15:tentative="1">
+    <w:lvl w:ilvl="8" w:tentative="1">
       <w:start w:val="1"/>
       <w:numFmt w:val="bullet"/>
       <w:lvlText w:val="●"/>
@@ -3603,7 +3757,7 @@
   </w:abstractNum>
   <w:abstractNum w:abstractNumId="2" w15:restartNumberingAfterBreak="0">
     <w:multiLevelType w:val="hybridMultilevel"/>
-    <w:lvl w:ilvl="0" w15:tentative="1">
+    <w:lvl w:ilvl="0" w:tentative="1">
       <w:start w:val="1"/>
       <w:numFmt w:val="bullet"/>
       <w:lvlText w:val="•"/>
@@ -3635,6 +3789,10 @@
     </w:rPrDefault>
     <w:pPrDefault/>
   </w:docDefaults>
+  <w:style w:type="paragraph" w:styleId="Normal" w:default="1">
+    <w:name w:val="Normal"/>
+    <w:qFormat/>
+  </w:style>
   <w:style w:type="paragraph" w:styleId="Title">
     <w:name w:val="Title"/>
     <w:basedOn w:val="Normal"/>
@@ -3807,4 +3965,294 @@
     </w:rPr>
   </w:style>
 </w:styles>
+</file>
+
+<file path=word/theme/theme1.xml><?xml version="1.0" encoding="utf-8"?>
+<a:theme xmlns:a="http://schemas.openxmlformats.org/drawingml/2006/main" name="Office Theme">
+  <a:themeElements>
+    <a:clrScheme name="Office">
+      <a:dk1>
+        <a:sysClr val="windowText" lastClr="000000"/>
+      </a:dk1>
+      <a:lt1>
+        <a:sysClr val="window" lastClr="FFFFFF"/>
+      </a:lt1>
+      <a:dk2>
+        <a:srgbClr val="44546A"/>
+      </a:dk2>
+      <a:lt2>
+        <a:srgbClr val="E7E6E6"/>
+      </a:lt2>
+      <a:accent1>
+        <a:srgbClr val="4472C4"/>
+      </a:accent1>
+      <a:accent2>
+        <a:srgbClr val="ED7D31"/>
+      </a:accent2>
+      <a:accent3>
+        <a:srgbClr val="A5A5A5"/>
+      </a:accent3>
+      <a:accent4>
+        <a:srgbClr val="FFC000"/>
+      </a:accent4>
+      <a:accent5>
+        <a:srgbClr val="5B9BD5"/>
+      </a:accent5>
+      <a:accent6>
+        <a:srgbClr val="70AD47"/>
+      </a:accent6>
+      <a:hlink>
+        <a:srgbClr val="0563C1"/>
+      </a:hlink>
+      <a:folHlink>
+        <a:srgbClr val="954F72"/>
+      </a:folHlink>
+    </a:clrScheme>
+    <a:fontScheme name="Office">
+      <a:majorFont>
+        <a:latin typeface="Calibri Light" panose="020F0302020204030204"/>
+        <a:ea typeface=""/>
+        <a:cs typeface=""/>
+        <a:font script="Jpan" typeface="游ゴシック Light"/>
+        <a:font script="Hang" typeface="맑은 고딕"/>
+        <a:font script="Hans" typeface="等线 Light"/>
+        <a:font script="Hant" typeface="新細明體"/>
+        <a:font script="Arab" typeface="Times New Roman"/>
+        <a:font script="Hebr" typeface="Times New Roman"/>
+        <a:font script="Thai" typeface="Angsana New"/>
+        <a:font script="Ethi" typeface="Nyala"/>
+        <a:font script="Beng" typeface="Vrinda"/>
+        <a:font script="Gujr" typeface="Shruti"/>
+        <a:font script="Khmr" typeface="MoolBoran"/>
+        <a:font script="Knda" typeface="Tunga"/>
+        <a:font script="Guru" typeface="Raavi"/>
+        <a:font script="Cans" typeface="Euphemia"/>
+        <a:font script="Cher" typeface="Plantagenet Cherokee"/>
+        <a:font script="Yiii" typeface="Microsoft Yi Baiti"/>
+        <a:font script="Tibt" typeface="Microsoft Himalaya"/>
+        <a:font script="Thaa" typeface="MV Boli"/>
+        <a:font script="Deva" typeface="Mangal"/>
+        <a:font script="Telu" typeface="Gautami"/>
+        <a:font script="Taml" typeface="Latha"/>
+        <a:font script="Syrc" typeface="Estrangelo Edessa"/>
+        <a:font script="Orya" typeface="Kalinga"/>
+        <a:font script="Mlym" typeface="Kartika"/>
+        <a:font script="Laoo" typeface="DokChampa"/>
+        <a:font script="Sinh" typeface="Iskoola Pota"/>
+        <a:font script="Mong" typeface="Mongolian Baiti"/>
+        <a:font script="Viet" typeface="Times New Roman"/>
+        <a:font script="Uigh" typeface="Microsoft Uighur"/>
+        <a:font script="Geor" typeface="Sylfaen"/>
+        <a:font script="Armn" typeface="Arial"/>
+        <a:font script="Bugi" typeface="Leelawadee UI"/>
+        <a:font script="Bopo" typeface="Microsoft JhengHei"/>
+        <a:font script="Java" typeface="Javanese Text"/>
+        <a:font script="Lisu" typeface="Segoe UI"/>
+        <a:font script="Mymr" typeface="Myanmar Text"/>
+        <a:font script="Nkoo" typeface="Ebrima"/>
+        <a:font script="Olck" typeface="Nirmala UI"/>
+        <a:font script="Osma" typeface="Ebrima"/>
+        <a:font script="Phag" typeface="Phagspa"/>
+        <a:font script="Syrn" typeface="Estrangelo Edessa"/>
+        <a:font script="Syrj" typeface="Estrangelo Edessa"/>
+        <a:font script="Syre" typeface="Estrangelo Edessa"/>
+        <a:font script="Sora" typeface="Nirmala UI"/>
+        <a:font script="Tale" typeface="Microsoft Tai Le"/>
+        <a:font script="Talu" typeface="Microsoft New Tai Lue"/>
+        <a:font script="Tfng" typeface="Ebrima"/>
+      </a:majorFont>
+      <a:minorFont>
+        <a:latin typeface="Calibri" panose="020F0502020204030204"/>
+        <a:ea typeface=""/>
+        <a:cs typeface=""/>
+        <a:font script="Jpan" typeface="游明朝"/>
+        <a:font script="Hang" typeface="맑은 고딕"/>
+        <a:font script="Hans" typeface="等线"/>
+        <a:font script="Hant" typeface="新細明體"/>
+        <a:font script="Arab" typeface="Arial"/>
+        <a:font script="Hebr" typeface="Arial"/>
+        <a:font script="Thai" typeface="Cordia New"/>
+        <a:font script="Ethi" typeface="Nyala"/>
+        <a:font script="Beng" typeface="Vrinda"/>
+        <a:font script="Gujr" typeface="Shruti"/>
+        <a:font script="Khmr" typeface="DaunPenh"/>
+        <a:font script="Knda" typeface="Tunga"/>
+        <a:font script="Guru" typeface="Raavi"/>
+        <a:font script="Cans" typeface="Euphemia"/>
+        <a:font script="Cher" typeface="Plantagenet Cherokee"/>
+        <a:font script="Yiii" typeface="Microsoft Yi Baiti"/>
+        <a:font script="Tibt" typeface="Microsoft Himalaya"/>
+        <a:font script="Thaa" typeface="MV Boli"/>
+        <a:font script="Deva" typeface="Mangal"/>
+        <a:font script="Telu" typeface="Gautami"/>
+        <a:font script="Taml" typeface="Latha"/>
+        <a:font script="Syrc" typeface="Estrangelo Edessa"/>
+        <a:font script="Orya" typeface="Kalinga"/>
+        <a:font script="Mlym" typeface="Kartika"/>
+        <a:font script="Laoo" typeface="DokChampa"/>
+        <a:font script="Sinh" typeface="Iskoola Pota"/>
+        <a:font script="Mong" typeface="Mongolian Baiti"/>
+        <a:font script="Viet" typeface="Arial"/>
+        <a:font script="Uigh" typeface="Microsoft Uighur"/>
+        <a:font script="Geor" typeface="Sylfaen"/>
+        <a:font script="Armn" typeface="Arial"/>
+        <a:font script="Bugi" typeface="Leelawadee UI"/>
+        <a:font script="Bopo" typeface="Microsoft JhengHei"/>
+        <a:font script="Java" typeface="Javanese Text"/>
+        <a:font script="Lisu" typeface="Segoe UI"/>
+        <a:font script="Mymr" typeface="Myanmar Text"/>
+        <a:font script="Nkoo" typeface="Ebrima"/>
+        <a:font script="Olck" typeface="Nirmala UI"/>
+        <a:font script="Osma" typeface="Ebrima"/>
+        <a:font script="Phag" typeface="Phagspa"/>
+        <a:font script="Syrn" typeface="Estrangelo Edessa"/>
+        <a:font script="Syrj" typeface="Estrangelo Edessa"/>
+        <a:font script="Syre" typeface="Estrangelo Edessa"/>
+        <a:font script="Sora" typeface="Nirmala UI"/>
+        <a:font script="Tale" typeface="Microsoft Tai Le"/>
+        <a:font script="Talu" typeface="Microsoft New Tai Lue"/>
+        <a:font script="Tfng" typeface="Ebrima"/>
+      </a:minorFont>
+    </a:fontScheme>
+    <a:fmtScheme name="Office">
+      <a:fillStyleLst>
+        <a:solidFill>
+          <a:schemeClr val="phClr"/>
+        </a:solidFill>
+        <a:gradFill rotWithShape="true">
+          <a:gsLst>
+            <a:gs pos="0">
+              <a:schemeClr val="phClr">
+                <a:lumMod val="110000"/>
+                <a:satMod val="105000"/>
+                <a:tint val="67000"/>
+              </a:schemeClr>
+            </a:gs>
+            <a:gs pos="50000">
+              <a:schemeClr val="phClr">
+                <a:lumMod val="105000"/>
+                <a:satMod val="103000"/>
+                <a:tint val="73000"/>
+              </a:schemeClr>
+            </a:gs>
+            <a:gs pos="100000">
+              <a:schemeClr val="phClr">
+                <a:lumMod val="105000"/>
+                <a:satMod val="109000"/>
+                <a:tint val="81000"/>
+              </a:schemeClr>
+            </a:gs>
+          </a:gsLst>
+          <a:lin ang="5400000" scaled="false"/>
+        </a:gradFill>
+        <a:gradFill rotWithShape="true">
+          <a:gsLst>
+            <a:gs pos="0">
+              <a:schemeClr val="phClr">
+                <a:satMod val="103000"/>
+                <a:lumMod val="102000"/>
+                <a:tint val="94000"/>
+              </a:schemeClr>
+            </a:gs>
+            <a:gs pos="50000">
+              <a:schemeClr val="phClr">
+                <a:satMod val="110000"/>
+                <a:lumMod val="100000"/>
+                <a:shade val="100000"/>
+              </a:schemeClr>
+            </a:gs>
+            <a:gs pos="100000">
+              <a:schemeClr val="phClr">
+                <a:lumMod val="99000"/>
+                <a:satMod val="120000"/>
+                <a:shade val="78000"/>
+              </a:schemeClr>
+            </a:gs>
+          </a:gsLst>
+          <a:lin ang="5400000" scaled="false"/>
+        </a:gradFill>
+      </a:fillStyleLst>
+      <a:lnStyleLst>
+        <a:ln w="6350" cap="flat" cmpd="sng" algn="ctr">
+          <a:solidFill>
+            <a:schemeClr val="phClr"/>
+          </a:solidFill>
+          <a:prstDash val="solid"/>
+          <a:miter lim="800000"/>
+        </a:ln>
+        <a:ln w="12700" cap="flat" cmpd="sng" algn="ctr">
+          <a:solidFill>
+            <a:schemeClr val="phClr"/>
+          </a:solidFill>
+          <a:prstDash val="solid"/>
+          <a:miter lim="800000"/>
+        </a:ln>
+        <a:ln w="19050" cap="flat" cmpd="sng" algn="ctr">
+          <a:solidFill>
+            <a:schemeClr val="phClr"/>
+          </a:solidFill>
+          <a:prstDash val="solid"/>
+          <a:miter lim="800000"/>
+        </a:ln>
+      </a:lnStyleLst>
+      <a:effectStyleLst>
+        <a:effectStyle>
+          <a:effectLst/>
+        </a:effectStyle>
+        <a:effectStyle>
+          <a:effectLst/>
+        </a:effectStyle>
+        <a:effectStyle>
+          <a:effectLst>
+            <a:outerShdw blurRad="57150" dist="19050" dir="5400000" algn="ctr" rotWithShape="false">
+              <a:srgbClr val="000000">
+                <a:alpha val="63000"/>
+              </a:srgbClr>
+            </a:outerShdw>
+          </a:effectLst>
+        </a:effectStyle>
+      </a:effectStyleLst>
+      <a:bgFillStyleLst>
+        <a:solidFill>
+          <a:schemeClr val="phClr"/>
+        </a:solidFill>
+        <a:solidFill>
+          <a:schemeClr val="phClr">
+            <a:tint val="95000"/>
+            <a:satMod val="170000"/>
+          </a:schemeClr>
+        </a:solidFill>
+        <a:gradFill rotWithShape="true">
+          <a:gsLst>
+            <a:gs pos="0">
+              <a:schemeClr val="phClr">
+                <a:tint val="93000"/>
+                <a:satMod val="150000"/>
+                <a:shade val="98000"/>
+                <a:lumMod val="102000"/>
+              </a:schemeClr>
+            </a:gs>
+            <a:gs pos="50000">
+              <a:schemeClr val="phClr">
+                <a:tint val="98000"/>
+                <a:satMod val="130000"/>
+                <a:shade val="90000"/>
+                <a:lumMod val="103000"/>
+              </a:schemeClr>
+            </a:gs>
+            <a:gs pos="100000">
+              <a:schemeClr val="phClr">
+                <a:shade val="63000"/>
+                <a:satMod val="120000"/>
+              </a:schemeClr>
+            </a:gs>
+          </a:gsLst>
+          <a:lin ang="5400000" scaled="false"/>
+        </a:gradFill>
+      </a:bgFillStyleLst>
+    </a:fmtScheme>
+  </a:themeElements>
+  <a:objectDefaults/>
+  <a:extraClrSchemeLst/>
+</a:theme>
 </file>
</xml_diff>

<commit_message>
Preenche o bloco de prova do E-mail 1 e corrige o destino do CTA
O bloco que dependia de confirmação passa a usar a versão segura, que
repete o que a G5 já publicou no próprio site e destaca o filtro de
credenciamento do programa, sem citar número de câmeras nem data de
licenciamento, para os quais não existe fonte pública.

O botão do E-mail 1 deixa de apontar para um texto não publicado e passa
a levar ao post da própria G5 sobre a integração, que está no ar e é
aderente ao assunto do disparo. Mapa de destinos e notas atualizados.

Co-Authored-By: Claude Opus 5 <noreply@anthropic.com>
Claude-Session: https://claude.ai/code/session_011Ls9e1ya7pUeqY3wg4Purw
</commit_message>
<xml_diff>
--- a/clientes/g5-seguranca/email/G5-Seguranca-Emails-Setembro.docx
+++ b/clientes/g5-seguranca/email/G5-Seguranca-Emails-Setembro.docx
@@ -783,7 +783,7 @@
                 <w:sz w:val="20"/>
                 <w:szCs w:val="20"/>
               </w:rPr>
-              <w:t xml:space="preserve">Terça, 15/09</w:t>
+              <w:t xml:space="preserve">A definir, outubro</w:t>
             </w:r>
           </w:p>
         </w:tc>
@@ -887,7 +887,7 @@
                 <w:sz w:val="20"/>
                 <w:szCs w:val="20"/>
               </w:rPr>
-              <w:t xml:space="preserve">Como escolher uma empresa de segurança confiável</w:t>
+              <w:t xml:space="preserve">G5 passa a integrar o Conecta Muralha</w:t>
             </w:r>
           </w:p>
         </w:tc>
@@ -1340,7 +1340,7 @@
                 <w:sz w:val="20"/>
                 <w:szCs w:val="20"/>
               </w:rPr>
-              <w:t xml:space="preserve">Como escolher uma empresa de segurança confiável</w:t>
+              <w:t xml:space="preserve">G5 Segurança passa a integrar o Conecta Muralha</w:t>
             </w:r>
           </w:p>
         </w:tc>
@@ -1366,7 +1366,7 @@
                 <w:sz w:val="20"/>
                 <w:szCs w:val="20"/>
               </w:rPr>
-              <w:t xml:space="preserve">/blog/como-escolher-empresa-de-seguranca-confiavel</w:t>
+              <w:t xml:space="preserve">/g5-seguranca-passa-a-integrar-o-conecta-muralha/</w:t>
             </w:r>
           </w:p>
         </w:tc>
@@ -1443,7 +1443,7 @@
                 <w:sz w:val="20"/>
                 <w:szCs w:val="20"/>
               </w:rPr>
-              <w:t xml:space="preserve">/blog/cftv-empresarial-como-planejar</w:t>
+              <w:t xml:space="preserve">/cftv-empresarial-como-planejar/</w:t>
             </w:r>
           </w:p>
         </w:tc>
@@ -1880,20 +1880,20 @@
     </w:p>
     <w:p>
       <w:pPr>
-        <w:shd w:fill="FFF2CC" w:color="auto" w:val="clear"/>
-        <w:spacing w:after="160" w:before="160" w:line="300"/>
-      </w:pPr>
-      <w:r>
-        <w:rPr>
-          <w:b w:val="false"/>
-          <w:bCs w:val="false"/>
-          <w:i/>
-          <w:iCs/>
-          <w:color w:val="7F6000"/>
-          <w:sz w:val="20"/>
-          <w:szCs w:val="20"/>
-        </w:rPr>
-        <w:t xml:space="preserve">[BLOCO DE PROVA: status da G5 no programa. Preencher com a informação confirmada, por exemplo número de câmeras já integradas ou data do licenciamento. Não publicar sem confirmação documental.]</w:t>
+        <w:spacing w:after="140" w:line="300"/>
+        <w:jc w:val="both"/>
+      </w:pPr>
+      <w:r>
+        <w:rPr>
+          <w:b w:val="false"/>
+          <w:bCs w:val="false"/>
+          <w:i w:val="false"/>
+          <w:iCs w:val="false"/>
+          <w:color w:val="000000"/>
+          <w:sz w:val="22"/>
+          <w:szCs w:val="22"/>
+        </w:rPr>
+        <w:t xml:space="preserve">A G5 integra o Conecta Muralha. Na prática, isso significa que passamos pelo mesmo filtro que o programa exige de qualquer participante: credenciamento na Polícia Federal, regularidade fiscal e projeto técnico aprovado pelo Comitê Gestor de Videomonitoramento da Prefeitura. Não é um selo de marketing, é uma checagem documental.</w:t>
       </w:r>
     </w:p>
     <w:p>
@@ -1929,7 +1929,7 @@
           <w:sz w:val="22"/>
           <w:szCs w:val="22"/>
         </w:rPr>
-        <w:t xml:space="preserve">Reunimos em um guia os pontos que separam uma empresa de segurança preparada de uma que vende equipamento com mensalidade: central própria ou terceirizada, protocolo de atendimento por escrito, escopo real de manutenção e o que perguntar antes de assinar.</w:t>
+        <w:t xml:space="preserve">Escrevemos no blog o que o programa é, quem pode participar e o que muda quando a câmera privada passa a conversar com a malha pública da cidade.</w:t>
       </w:r>
     </w:p>
     <w:p>
@@ -1946,7 +1946,7 @@
           <w:sz w:val="22"/>
           <w:szCs w:val="22"/>
         </w:rPr>
-        <w:t xml:space="preserve">BOTÃO: Ver os critérios para avaliar sua empresa de segurança</w:t>
+        <w:t xml:space="preserve">BOTÃO: Ver como a G5 participa do Conecta Muralha</w:t>
       </w:r>
     </w:p>
     <w:p>
@@ -3313,19 +3313,19 @@
           <w:sz w:val="22"/>
           <w:szCs w:val="22"/>
         </w:rPr>
-        <w:t xml:space="preserve">Antes de disparar o E-mail 1:</w:t>
-      </w:r>
-      <w:r>
-        <w:rPr>
-          <w:b w:val="false"/>
-          <w:bCs w:val="false"/>
-          <w:i w:val="false"/>
-          <w:iCs w:val="false"/>
-          <w:color w:val="000000"/>
-          <w:sz w:val="22"/>
-          <w:szCs w:val="22"/>
-        </w:rPr>
-        <w:t xml:space="preserve"> confirmar documentalmente o status da G5 no Conecta Muralha. A afirmação é verificável junto à Prefeitura e não deve ir ao ar sem comprovação. Se o licenciamento ainda estiver em análise, trocar o bloco de prova por uma formulação factual, como "estamos em processo de licenciamento", que também comunica movimento sem risco.</w:t>
+        <w:t xml:space="preserve">Bloco de prova do E-mail 1:</w:t>
+      </w:r>
+      <w:r>
+        <w:rPr>
+          <w:b w:val="false"/>
+          <w:bCs w:val="false"/>
+          <w:i w:val="false"/>
+          <w:iCs w:val="false"/>
+          <w:color w:val="000000"/>
+          <w:sz w:val="22"/>
+          <w:szCs w:val="22"/>
+        </w:rPr>
+        <w:t xml:space="preserve"> está na versão segura, que repete apenas o que a G5 já publicou no próprio site e destaca o filtro de credenciamento exigido pelo programa. Não cita número de câmeras nem data de licenciamento, porque não existe fonte pública para esses dados. Quando o cliente enviar o licenciamento emitido pela Secretaria de Defesa Social e Trânsito, com protocolo e data, o bloco pode ser trocado pela versão com números.</w:t>
       </w:r>
     </w:p>
     <w:p>

</xml_diff>